<commit_message>
8/16: dbStopFlag Cancel/Stop 행 표시, BeginInvoke 재진입 방지, Balance PLC 매핑, 배포용 원복
</commit_message>
<xml_diff>
--- a/KI-RnB_작업보고서_20260815.docx
+++ b/KI-RnB_작업보고서_20260815.docx
@@ -4708,12 +4708,12 @@
         <w:rPr>
           <w:rFonts w:ascii="맑은 고딕" w:hAnsi="맑은 고딕"/>
         </w:rPr>
-        <w:t>6.5 dgv_List 더블클릭 에러 수정</w:t>
+        <w:t>6.5 dgv_List 더블클릭 에러 및 재진입 방지</w:t>
       </w:r>
     </w:p>
     <w:p>
       <w:r>
-        <w:t>CellDoubleClick과 CurrentCellChanged 이벤트가 동시에 SelectResult를 호출하여 SetCurrentCellAddressCore 재진입 에러 발생. CellDoubleClick 이벤트 등록 제거.</w:t>
+        <w:t>CellDoubleClick과 CurrentCellChanged 이벤트가 동시에 SelectResult를 호출하여 SetCurrentCellAddressCore 재진입 에러 발생. CellDoubleClick 이벤트 등록 제거 및 SelectResult를 BeginInvoke로 감싸서 DataGridView 셀 변경 완료 후 실행되도록 수정.</w:t>
       </w:r>
     </w:p>
     <w:p>
@@ -4724,7 +4724,23 @@
         <w:rPr>
           <w:rFonts w:ascii="맑은 고딕" w:hAnsi="맑은 고딕"/>
         </w:rPr>
-        <w:t>6.6 DB 컬럼명 수정 및 기타</w:t>
+        <w:t>6.6 Cancel/Stop 행 표시 (dbStopFlag)</w:t>
+      </w:r>
+    </w:p>
+    <w:p>
+      <w:r>
+        <w:t>tbl_InfoData에 dbStopFlag 컬럼 추가. 검사 종료 시 TSet.StopFlag 값을 DB에 저장. dgv_List에서 StopFlag &gt; 0인 행의 VINNO 텍스트를 빨간색으로 표시. 첫 번째 Info_DataAdd 호출 전 TSet.StopFlag = 0 초기화 추가.</w:t>
+      </w:r>
+    </w:p>
+    <w:p>
+      <w:pPr>
+        <w:pStyle w:val="Heading2"/>
+      </w:pPr>
+      <w:r>
+        <w:rPr>
+          <w:rFonts w:ascii="맑은 고딕" w:hAnsi="맑은 고딕"/>
+        </w:rPr>
+        <w:t>6.8 DB 컬럼명 수정 및 기타</w:t>
       </w:r>
     </w:p>
     <w:p>
@@ -4773,7 +4789,7 @@
         <w:rPr>
           <w:rFonts w:ascii="맑은 고딕" w:hAnsi="맑은 고딕"/>
         </w:rPr>
-        <w:t>6.7 cboModel 드롭다운 닫힘 방지</w:t>
+        <w:t>6.9 cboModel 드롭다운 닫힘 방지</w:t>
       </w:r>
     </w:p>
     <w:p>
@@ -4849,7 +4865,7 @@
         <w:rPr>
           <w:rFonts w:ascii="맑은 고딕" w:hAnsi="맑은 고딕"/>
         </w:rPr>
-        <w:t>6.8 fomCurve 새 커브 타이틀 표시</w:t>
+        <w:t>6.10 fomCurve 새 커브 타이틀 표시</w:t>
       </w:r>
     </w:p>
     <w:p>
@@ -4865,7 +4881,7 @@
         <w:rPr>
           <w:rFonts w:ascii="맑은 고딕" w:hAnsi="맑은 고딕"/>
         </w:rPr>
-        <w:t>6.9 icsNeoClass catch 타입 복원</w:t>
+        <w:t>6.11 icsNeoClass catch 타입 복원</w:t>
       </w:r>
     </w:p>
     <w:p>
@@ -4881,7 +4897,7 @@
         <w:rPr>
           <w:rFonts w:ascii="맑은 고딕" w:hAnsi="맑은 고딕"/>
         </w:rPr>
-        <w:t>6.10 배포용 원복 (2건)</w:t>
+        <w:t>6.12 배포용 원복 (2건)</w:t>
       </w:r>
     </w:p>
     <w:tbl>

</xml_diff>

<commit_message>
fix: TesterPresent PCI 누락 및 ABS 밸브 제어 실패 수정
- clsNeoVI: TesterPresent 프레임 "3E 80" → "02 3E 80" (ISO-TP SF PCI 누락)
- clsNeoVI: Ret_SendMsgs 를 TxLock 으로 배타 처리,
  Send_TesterPresent 은 Monitor.TryEnter 로 통신 중 주기 skip
  → FF↔CF 사이 TP 침입으로 ISO-TP 조립이 깨져 2F 밸브 제어가
    5단계 중 2~3단계만 성공하던 문제 해결
- clsNeoVI: STD_CAN_Write 비Chery 분기 Sleep(500) → Sleep(30) (FF→CF 51ms)
- fom_Main/cls_Test: SendTP(true) 를 Test_Running 의 ECU_Selector 직후로 이동,
  OrderStarted 는 try/finally 로 SendTP(false) 보장
- cls_Test: Dynamic_Close() 추가 — Dynamic Test 종료 직후 Stop_Communication 으로
  IOControl 제어권 반납. 검사 후 주차 브레이크 동작 불가 회귀 해결

실차 검증: TM/NX4 5/5 (2026082200017), LX3 9/9 (…00019, …00020),
주차 브레이크 정상, TP의 FF↔CF 침입 0건
</commit_message>
<xml_diff>
--- a/KI-RnB_작업보고서_20260815.docx
+++ b/KI-RnB_작업보고서_20260815.docx
@@ -7824,6 +7824,984 @@
         <w:t>tmr_Wait 재진입: DoEvents로 재진입해도 같은 Get_Buf에 쌓임. IsRead 가드 있음</w:t>
       </w:r>
     </w:p>
+    <w:p>
+      <w:pPr>
+        <w:pStyle w:val="Heading1"/>
+      </w:pPr>
+      <w:r>
+        <w:rPr>
+          <w:sz w:val="28"/>
+        </w:rPr>
+        <w:t>2026-08-22 — TesterPresent 전 차종 적용 및 ABS 밸브 제어 실패 수정</w:t>
+      </w:r>
+    </w:p>
+    <w:p>
+      <w:pPr>
+        <w:pStyle w:val="Heading2"/>
+      </w:pPr>
+      <w:r>
+        <w:t>1. 증상</w:t>
+      </w:r>
+    </w:p>
+    <w:tbl>
+      <w:tblPr>
+        <w:tblStyle w:val="TableGrid"/>
+        <w:tblW w:type="auto" w:w="0"/>
+        <w:tblLook w:firstColumn="1" w:firstRow="1" w:lastColumn="0" w:lastRow="0" w:noHBand="0" w:noVBand="1" w:val="04A0"/>
+      </w:tblPr>
+      <w:tblGrid>
+        <w:gridCol w:w="3135"/>
+        <w:gridCol w:w="3135"/>
+        <w:gridCol w:w="3135"/>
+      </w:tblGrid>
+      <w:tr>
+        <w:tc>
+          <w:tcPr>
+            <w:tcW w:type="dxa" w:w="3135"/>
+          </w:tcPr>
+          <w:p>
+            <w:r>
+              <w:rPr>
+                <w:b/>
+              </w:rPr>
+              <w:t>증상</w:t>
+            </w:r>
+          </w:p>
+        </w:tc>
+        <w:tc>
+          <w:tcPr>
+            <w:tcW w:type="dxa" w:w="3135"/>
+          </w:tcPr>
+          <w:p>
+            <w:r>
+              <w:rPr>
+                <w:b/>
+              </w:rPr>
+              <w:t>차종</w:t>
+            </w:r>
+          </w:p>
+        </w:tc>
+        <w:tc>
+          <w:tcPr>
+            <w:tcW w:type="dxa" w:w="3135"/>
+          </w:tcPr>
+          <w:p>
+            <w:r>
+              <w:rPr>
+                <w:b/>
+              </w:rPr>
+              <w:t>내용</w:t>
+            </w:r>
+          </w:p>
+        </w:tc>
+      </w:tr>
+      <w:tr>
+        <w:tc>
+          <w:tcPr>
+            <w:tcW w:type="dxa" w:w="3135"/>
+          </w:tcPr>
+          <w:p>
+            <w:r>
+              <w:t>A</w:t>
+            </w:r>
+          </w:p>
+        </w:tc>
+        <w:tc>
+          <w:tcPr>
+            <w:tcW w:type="dxa" w:w="3135"/>
+          </w:tcPr>
+          <w:p>
+            <w:r>
+              <w:t>LX3 HEV / LX3 ICE</w:t>
+            </w:r>
+          </w:p>
+        </w:tc>
+        <w:tc>
+          <w:tcPr>
+            <w:tcW w:type="dxa" w:w="3135"/>
+          </w:tcPr>
+          <w:p>
+            <w:r>
+              <w:t>Dynamic Test 2F 밸브 제어가 5단계 중 2~3단계만 성공</w:t>
+            </w:r>
+          </w:p>
+        </w:tc>
+      </w:tr>
+      <w:tr>
+        <w:tc>
+          <w:tcPr>
+            <w:tcW w:type="dxa" w:w="3135"/>
+          </w:tcPr>
+          <w:p>
+            <w:r>
+              <w:t>B</w:t>
+            </w:r>
+          </w:p>
+        </w:tc>
+        <w:tc>
+          <w:tcPr>
+            <w:tcW w:type="dxa" w:w="3135"/>
+          </w:tcPr>
+          <w:p>
+            <w:r>
+              <w:t>LX3 / NX4 (TM)</w:t>
+            </w:r>
+          </w:p>
+        </w:tc>
+        <w:tc>
+          <w:tcPr>
+            <w:tcW w:type="dxa" w:w="3135"/>
+          </w:tcPr>
+          <w:p>
+            <w:r>
+              <w:t>Dynamic Test 후 주차 브레이크 동작 불가</w:t>
+            </w:r>
+          </w:p>
+        </w:tc>
+      </w:tr>
+    </w:tbl>
+    <w:p>
+      <w:pPr>
+        <w:pStyle w:val="Heading2"/>
+      </w:pPr>
+      <w:r>
+        <w:t>2. 원인</w:t>
+      </w:r>
+    </w:p>
+    <w:p>
+      <w:pPr>
+        <w:pStyle w:val="ListBullet"/>
+      </w:pPr>
+      <w:r>
+        <w:t>증상 A — ISO-TP PCI 누락 + FF↔CF 사이 TP 침입</w:t>
+      </w:r>
+    </w:p>
+    <w:p>
+      <w:r>
+        <w:t>TpTimer(500ms)가 CAN_Transmit("3E 80")을 직접 호출. ISO-TP Single Frame PCI(02)가 누락되어 ECU가 무시하는 동시에, Ret_SendMsgs와 배타 제어 없이 동시 실행되어 FF↔CF 사이에 TP 프레임이 끼어들어 ISO-TP 조립 깨짐.</w:t>
+      </w:r>
+    </w:p>
+    <w:p>
+      <w:pPr>
+        <w:pStyle w:val="ListBullet"/>
+      </w:pPr>
+      <w:r>
+        <w:t>증상 B — Dynamic Test 종료 시 IOControl 제어권 미반납</w:t>
+      </w:r>
+    </w:p>
+    <w:p>
+      <w:r>
+        <w:t>Dynamic Test 완료 후 Stop_Communication(Default Session 복귀)이 없어 ECU가 IOControl 제어 상태 유지. 이후 주차 브레이크 PLC 제어에 ECU가 개입하여 동작 불가.</w:t>
+      </w:r>
+    </w:p>
+    <w:p>
+      <w:pPr>
+        <w:pStyle w:val="Heading2"/>
+      </w:pPr>
+      <w:r>
+        <w:t>3. 수정 내용</w:t>
+      </w:r>
+    </w:p>
+    <w:p>
+      <w:pPr>
+        <w:pStyle w:val="Heading3"/>
+      </w:pPr>
+      <w:r>
+        <w:t>3.1 clsNeoVI.cs</w:t>
+      </w:r>
+    </w:p>
+    <w:tbl>
+      <w:tblPr>
+        <w:tblStyle w:val="TableGrid"/>
+        <w:tblW w:type="auto" w:w="0"/>
+        <w:tblLook w:firstColumn="1" w:firstRow="1" w:lastColumn="0" w:lastRow="0" w:noHBand="0" w:noVBand="1" w:val="04A0"/>
+      </w:tblPr>
+      <w:tblGrid>
+        <w:gridCol w:w="2351"/>
+        <w:gridCol w:w="2351"/>
+        <w:gridCol w:w="2351"/>
+        <w:gridCol w:w="2351"/>
+      </w:tblGrid>
+      <w:tr>
+        <w:tc>
+          <w:tcPr>
+            <w:tcW w:type="dxa" w:w="2351"/>
+          </w:tcPr>
+          <w:p>
+            <w:r>
+              <w:rPr>
+                <w:b/>
+              </w:rPr>
+              <w:t>#</w:t>
+            </w:r>
+          </w:p>
+        </w:tc>
+        <w:tc>
+          <w:tcPr>
+            <w:tcW w:type="dxa" w:w="2351"/>
+          </w:tcPr>
+          <w:p>
+            <w:r>
+              <w:rPr>
+                <w:b/>
+              </w:rPr>
+              <w:t>항목</w:t>
+            </w:r>
+          </w:p>
+        </w:tc>
+        <w:tc>
+          <w:tcPr>
+            <w:tcW w:type="dxa" w:w="2351"/>
+          </w:tcPr>
+          <w:p>
+            <w:r>
+              <w:rPr>
+                <w:b/>
+              </w:rPr>
+              <w:t>수정 전</w:t>
+            </w:r>
+          </w:p>
+        </w:tc>
+        <w:tc>
+          <w:tcPr>
+            <w:tcW w:type="dxa" w:w="2351"/>
+          </w:tcPr>
+          <w:p>
+            <w:r>
+              <w:rPr>
+                <w:b/>
+              </w:rPr>
+              <w:t>수정 후</w:t>
+            </w:r>
+          </w:p>
+        </w:tc>
+      </w:tr>
+      <w:tr>
+        <w:tc>
+          <w:tcPr>
+            <w:tcW w:type="dxa" w:w="2351"/>
+          </w:tcPr>
+          <w:p>
+            <w:r>
+              <w:t>①</w:t>
+            </w:r>
+          </w:p>
+        </w:tc>
+        <w:tc>
+          <w:tcPr>
+            <w:tcW w:type="dxa" w:w="2351"/>
+          </w:tcPr>
+          <w:p>
+            <w:r>
+              <w:t>TP 프레임</w:t>
+            </w:r>
+          </w:p>
+        </w:tc>
+        <w:tc>
+          <w:tcPr>
+            <w:tcW w:type="dxa" w:w="2351"/>
+          </w:tcPr>
+          <w:p>
+            <w:r>
+              <w:t>"3E 80" (PCI 없음)</w:t>
+            </w:r>
+          </w:p>
+        </w:tc>
+        <w:tc>
+          <w:tcPr>
+            <w:tcW w:type="dxa" w:w="2351"/>
+          </w:tcPr>
+          <w:p>
+            <w:r>
+              <w:t>"02 3E 80" (ISO-TP SF PCI 포함)</w:t>
+            </w:r>
+          </w:p>
+        </w:tc>
+      </w:tr>
+      <w:tr>
+        <w:tc>
+          <w:tcPr>
+            <w:tcW w:type="dxa" w:w="2351"/>
+          </w:tcPr>
+          <w:p>
+            <w:r>
+              <w:t>②</w:t>
+            </w:r>
+          </w:p>
+        </w:tc>
+        <w:tc>
+          <w:tcPr>
+            <w:tcW w:type="dxa" w:w="2351"/>
+          </w:tcPr>
+          <w:p>
+            <w:r>
+              <w:t>송신 배타 락</w:t>
+            </w:r>
+          </w:p>
+        </w:tc>
+        <w:tc>
+          <w:tcPr>
+            <w:tcW w:type="dxa" w:w="2351"/>
+          </w:tcPr>
+          <w:p>
+            <w:r>
+              <w:t>없음</w:t>
+            </w:r>
+          </w:p>
+        </w:tc>
+        <w:tc>
+          <w:tcPr>
+            <w:tcW w:type="dxa" w:w="2351"/>
+          </w:tcPr>
+          <w:p>
+            <w:r>
+              <w:t>TxLock + Ret_SendMsgs 전체 lock(TxLock)</w:t>
+            </w:r>
+          </w:p>
+        </w:tc>
+      </w:tr>
+      <w:tr>
+        <w:tc>
+          <w:tcPr>
+            <w:tcW w:type="dxa" w:w="2351"/>
+          </w:tcPr>
+          <w:p>
+            <w:r>
+              <w:t>③</w:t>
+            </w:r>
+          </w:p>
+        </w:tc>
+        <w:tc>
+          <w:tcPr>
+            <w:tcW w:type="dxa" w:w="2351"/>
+          </w:tcPr>
+          <w:p>
+            <w:r>
+              <w:t>TP 전용 함수</w:t>
+            </w:r>
+          </w:p>
+        </w:tc>
+        <w:tc>
+          <w:tcPr>
+            <w:tcW w:type="dxa" w:w="2351"/>
+          </w:tcPr>
+          <w:p>
+            <w:r>
+              <w:t>없음</w:t>
+            </w:r>
+          </w:p>
+        </w:tc>
+        <w:tc>
+          <w:tcPr>
+            <w:tcW w:type="dxa" w:w="2351"/>
+          </w:tcPr>
+          <w:p>
+            <w:r>
+              <w:t>Send_TesterPresent() — Monitor.TryEnter로 통신 중 skip</w:t>
+            </w:r>
+          </w:p>
+        </w:tc>
+      </w:tr>
+      <w:tr>
+        <w:tc>
+          <w:tcPr>
+            <w:tcW w:type="dxa" w:w="2351"/>
+          </w:tcPr>
+          <w:p>
+            <w:r>
+              <w:t>④</w:t>
+            </w:r>
+          </w:p>
+        </w:tc>
+        <w:tc>
+          <w:tcPr>
+            <w:tcW w:type="dxa" w:w="2351"/>
+          </w:tcPr>
+          <w:p>
+            <w:r>
+              <w:t>STD_CAN_Write 비Chery 지연</w:t>
+            </w:r>
+          </w:p>
+        </w:tc>
+        <w:tc>
+          <w:tcPr>
+            <w:tcW w:type="dxa" w:w="2351"/>
+          </w:tcPr>
+          <w:p>
+            <w:r>
+              <w:t>Sleep(500)</w:t>
+            </w:r>
+          </w:p>
+        </w:tc>
+        <w:tc>
+          <w:tcPr>
+            <w:tcW w:type="dxa" w:w="2351"/>
+          </w:tcPr>
+          <w:p>
+            <w:r>
+              <w:t>Sleep(30) (FF→CF 51ms)</w:t>
+            </w:r>
+          </w:p>
+        </w:tc>
+      </w:tr>
+    </w:tbl>
+    <w:p>
+      <w:pPr>
+        <w:pStyle w:val="Heading3"/>
+      </w:pPr>
+      <w:r>
+        <w:t>3.2 fom_Main.cs</w:t>
+      </w:r>
+    </w:p>
+    <w:tbl>
+      <w:tblPr>
+        <w:tblStyle w:val="TableGrid"/>
+        <w:tblW w:type="auto" w:w="0"/>
+        <w:tblLook w:firstColumn="1" w:firstRow="1" w:lastColumn="0" w:lastRow="0" w:noHBand="0" w:noVBand="1" w:val="04A0"/>
+      </w:tblPr>
+      <w:tblGrid>
+        <w:gridCol w:w="3135"/>
+        <w:gridCol w:w="3135"/>
+        <w:gridCol w:w="3135"/>
+      </w:tblGrid>
+      <w:tr>
+        <w:tc>
+          <w:tcPr>
+            <w:tcW w:type="dxa" w:w="3135"/>
+          </w:tcPr>
+          <w:p>
+            <w:r>
+              <w:rPr>
+                <w:b/>
+              </w:rPr>
+              <w:t>#</w:t>
+            </w:r>
+          </w:p>
+        </w:tc>
+        <w:tc>
+          <w:tcPr>
+            <w:tcW w:type="dxa" w:w="3135"/>
+          </w:tcPr>
+          <w:p>
+            <w:r>
+              <w:rPr>
+                <w:b/>
+              </w:rPr>
+              <w:t>항목</w:t>
+            </w:r>
+          </w:p>
+        </w:tc>
+        <w:tc>
+          <w:tcPr>
+            <w:tcW w:type="dxa" w:w="3135"/>
+          </w:tcPr>
+          <w:p>
+            <w:r>
+              <w:rPr>
+                <w:b/>
+              </w:rPr>
+              <w:t>내용</w:t>
+            </w:r>
+          </w:p>
+        </w:tc>
+      </w:tr>
+      <w:tr>
+        <w:tc>
+          <w:tcPr>
+            <w:tcW w:type="dxa" w:w="3135"/>
+          </w:tcPr>
+          <w:p>
+            <w:r>
+              <w:t>⑤</w:t>
+            </w:r>
+          </w:p>
+        </w:tc>
+        <w:tc>
+          <w:tcPr>
+            <w:tcW w:type="dxa" w:w="3135"/>
+          </w:tcPr>
+          <w:p>
+            <w:r>
+              <w:t>TpTimer 핸들러</w:t>
+            </w:r>
+          </w:p>
+        </w:tc>
+        <w:tc>
+          <w:tcPr>
+            <w:tcW w:type="dxa" w:w="3135"/>
+          </w:tcPr>
+          <w:p>
+            <w:r>
+              <w:t>CAN_Transmit("3E 80") → Send_TesterPresent()</w:t>
+            </w:r>
+          </w:p>
+        </w:tc>
+      </w:tr>
+      <w:tr>
+        <w:tc>
+          <w:tcPr>
+            <w:tcW w:type="dxa" w:w="3135"/>
+          </w:tcPr>
+          <w:p>
+            <w:r>
+              <w:t>⑥</w:t>
+            </w:r>
+          </w:p>
+        </w:tc>
+        <w:tc>
+          <w:tcPr>
+            <w:tcW w:type="dxa" w:w="3135"/>
+          </w:tcPr>
+          <w:p>
+            <w:r>
+              <w:t>SendTP(true) 위치</w:t>
+            </w:r>
+          </w:p>
+        </w:tc>
+        <w:tc>
+          <w:tcPr>
+            <w:tcW w:type="dxa" w:w="3135"/>
+          </w:tcPr>
+          <w:p>
+            <w:r>
+              <w:t>OrderStarted → Test_Running ECU_Selector 직후</w:t>
+            </w:r>
+          </w:p>
+        </w:tc>
+      </w:tr>
+      <w:tr>
+        <w:tc>
+          <w:tcPr>
+            <w:tcW w:type="dxa" w:w="3135"/>
+          </w:tcPr>
+          <w:p>
+            <w:r>
+              <w:t>⑦</w:t>
+            </w:r>
+          </w:p>
+        </w:tc>
+        <w:tc>
+          <w:tcPr>
+            <w:tcW w:type="dxa" w:w="3135"/>
+          </w:tcPr>
+          <w:p>
+            <w:r>
+              <w:t>SendTP(false) 보장</w:t>
+            </w:r>
+          </w:p>
+        </w:tc>
+        <w:tc>
+          <w:tcPr>
+            <w:tcW w:type="dxa" w:w="3135"/>
+          </w:tcPr>
+          <w:p>
+            <w:r>
+              <w:t>Test_Running 호출을 try/finally로 감싸 비정상 종료 시에도 TP 종료</w:t>
+            </w:r>
+          </w:p>
+        </w:tc>
+      </w:tr>
+    </w:tbl>
+    <w:p>
+      <w:pPr>
+        <w:pStyle w:val="Heading3"/>
+      </w:pPr>
+      <w:r>
+        <w:t>3.3 cls_Test.cs</w:t>
+      </w:r>
+    </w:p>
+    <w:tbl>
+      <w:tblPr>
+        <w:tblStyle w:val="TableGrid"/>
+        <w:tblW w:type="auto" w:w="0"/>
+        <w:tblLook w:firstColumn="1" w:firstRow="1" w:lastColumn="0" w:lastRow="0" w:noHBand="0" w:noVBand="1" w:val="04A0"/>
+      </w:tblPr>
+      <w:tblGrid>
+        <w:gridCol w:w="3135"/>
+        <w:gridCol w:w="3135"/>
+        <w:gridCol w:w="3135"/>
+      </w:tblGrid>
+      <w:tr>
+        <w:tc>
+          <w:tcPr>
+            <w:tcW w:type="dxa" w:w="3135"/>
+          </w:tcPr>
+          <w:p>
+            <w:r>
+              <w:rPr>
+                <w:b/>
+              </w:rPr>
+              <w:t>#</w:t>
+            </w:r>
+          </w:p>
+        </w:tc>
+        <w:tc>
+          <w:tcPr>
+            <w:tcW w:type="dxa" w:w="3135"/>
+          </w:tcPr>
+          <w:p>
+            <w:r>
+              <w:rPr>
+                <w:b/>
+              </w:rPr>
+              <w:t>항목</w:t>
+            </w:r>
+          </w:p>
+        </w:tc>
+        <w:tc>
+          <w:tcPr>
+            <w:tcW w:type="dxa" w:w="3135"/>
+          </w:tcPr>
+          <w:p>
+            <w:r>
+              <w:rPr>
+                <w:b/>
+              </w:rPr>
+              <w:t>내용</w:t>
+            </w:r>
+          </w:p>
+        </w:tc>
+      </w:tr>
+      <w:tr>
+        <w:tc>
+          <w:tcPr>
+            <w:tcW w:type="dxa" w:w="3135"/>
+          </w:tcPr>
+          <w:p>
+            <w:r>
+              <w:t>⑧</w:t>
+            </w:r>
+          </w:p>
+        </w:tc>
+        <w:tc>
+          <w:tcPr>
+            <w:tcW w:type="dxa" w:w="3135"/>
+          </w:tcPr>
+          <w:p>
+            <w:r>
+              <w:t>SendTP(true) 위치</w:t>
+            </w:r>
+          </w:p>
+        </w:tc>
+        <w:tc>
+          <w:tcPr>
+            <w:tcW w:type="dxa" w:w="3135"/>
+          </w:tcPr>
+          <w:p>
+            <w:r>
+              <w:t>Test_Running() — ECU_Selector 직후 (Chery 제외)</w:t>
+            </w:r>
+          </w:p>
+        </w:tc>
+      </w:tr>
+      <w:tr>
+        <w:tc>
+          <w:tcPr>
+            <w:tcW w:type="dxa" w:w="3135"/>
+          </w:tcPr>
+          <w:p>
+            <w:r>
+              <w:t>⑨</w:t>
+            </w:r>
+          </w:p>
+        </w:tc>
+        <w:tc>
+          <w:tcPr>
+            <w:tcW w:type="dxa" w:w="3135"/>
+          </w:tcPr>
+          <w:p>
+            <w:r>
+              <w:t>Dynamic_Close() 추가</w:t>
+            </w:r>
+          </w:p>
+        </w:tc>
+        <w:tc>
+          <w:tcPr>
+            <w:tcW w:type="dxa" w:w="3135"/>
+          </w:tcPr>
+          <w:p>
+            <w:r>
+              <w:t>Stop_Communication + SendTP(false) + ABS_Step=5 일괄 처리</w:t>
+            </w:r>
+          </w:p>
+        </w:tc>
+      </w:tr>
+      <w:tr>
+        <w:tc>
+          <w:tcPr>
+            <w:tcW w:type="dxa" w:w="3135"/>
+          </w:tcPr>
+          <w:p>
+            <w:r>
+              <w:t>⑩</w:t>
+            </w:r>
+          </w:p>
+        </w:tc>
+        <w:tc>
+          <w:tcPr>
+            <w:tcW w:type="dxa" w:w="3135"/>
+          </w:tcPr>
+          <w:p>
+            <w:r>
+              <w:t>LX3 Dynamic_Test 확장</w:t>
+            </w:r>
+          </w:p>
+        </w:tc>
+        <w:tc>
+          <w:tcPr>
+            <w:tcW w:type="dxa" w:w="3135"/>
+          </w:tcPr>
+          <w:p>
+            <w:r>
+              <w:t>step 6~9 (FL+RR 밸브 + Pump) 추가. LX3H/LX3I만 해당</w:t>
+            </w:r>
+          </w:p>
+        </w:tc>
+      </w:tr>
+    </w:tbl>
+    <w:p>
+      <w:pPr>
+        <w:pStyle w:val="Heading2"/>
+      </w:pPr>
+      <w:r>
+        <w:t>4. 실차 검증 결과</w:t>
+      </w:r>
+    </w:p>
+    <w:tbl>
+      <w:tblPr>
+        <w:tblStyle w:val="TableGrid"/>
+        <w:tblW w:type="auto" w:w="0"/>
+        <w:tblLook w:firstColumn="1" w:firstRow="1" w:lastColumn="0" w:lastRow="0" w:noHBand="0" w:noVBand="1" w:val="04A0"/>
+      </w:tblPr>
+      <w:tblGrid>
+        <w:gridCol w:w="2351"/>
+        <w:gridCol w:w="2351"/>
+        <w:gridCol w:w="2351"/>
+        <w:gridCol w:w="2351"/>
+      </w:tblGrid>
+      <w:tr>
+        <w:tc>
+          <w:tcPr>
+            <w:tcW w:type="dxa" w:w="2351"/>
+          </w:tcPr>
+          <w:p>
+            <w:r>
+              <w:rPr>
+                <w:b/>
+              </w:rPr>
+              <w:t>차종</w:t>
+            </w:r>
+          </w:p>
+        </w:tc>
+        <w:tc>
+          <w:tcPr>
+            <w:tcW w:type="dxa" w:w="2351"/>
+          </w:tcPr>
+          <w:p>
+            <w:r>
+              <w:rPr>
+                <w:b/>
+              </w:rPr>
+              <w:t>Dynamic</w:t>
+            </w:r>
+          </w:p>
+        </w:tc>
+        <w:tc>
+          <w:tcPr>
+            <w:tcW w:type="dxa" w:w="2351"/>
+          </w:tcPr>
+          <w:p>
+            <w:r>
+              <w:rPr>
+                <w:b/>
+              </w:rPr>
+              <w:t>주차 브레이크</w:t>
+            </w:r>
+          </w:p>
+        </w:tc>
+        <w:tc>
+          <w:tcPr>
+            <w:tcW w:type="dxa" w:w="2351"/>
+          </w:tcPr>
+          <w:p>
+            <w:r>
+              <w:rPr>
+                <w:b/>
+              </w:rPr>
+              <w:t>작업번호</w:t>
+            </w:r>
+          </w:p>
+        </w:tc>
+      </w:tr>
+      <w:tr>
+        <w:tc>
+          <w:tcPr>
+            <w:tcW w:type="dxa" w:w="2351"/>
+          </w:tcPr>
+          <w:p>
+            <w:r>
+              <w:t>NX4 PE HEV (TM)</w:t>
+            </w:r>
+          </w:p>
+        </w:tc>
+        <w:tc>
+          <w:tcPr>
+            <w:tcW w:type="dxa" w:w="2351"/>
+          </w:tcPr>
+          <w:p>
+            <w:r>
+              <w:t>5/5 성공</w:t>
+            </w:r>
+          </w:p>
+        </w:tc>
+        <w:tc>
+          <w:tcPr>
+            <w:tcW w:type="dxa" w:w="2351"/>
+          </w:tcPr>
+          <w:p>
+            <w:r>
+              <w:t>정상</w:t>
+            </w:r>
+          </w:p>
+        </w:tc>
+        <w:tc>
+          <w:tcPr>
+            <w:tcW w:type="dxa" w:w="2351"/>
+          </w:tcPr>
+          <w:p>
+            <w:r>
+              <w:t>2026082200017</w:t>
+            </w:r>
+          </w:p>
+        </w:tc>
+      </w:tr>
+      <w:tr>
+        <w:tc>
+          <w:tcPr>
+            <w:tcW w:type="dxa" w:w="2351"/>
+          </w:tcPr>
+          <w:p>
+            <w:r>
+              <w:t>LX3 HEV</w:t>
+            </w:r>
+          </w:p>
+        </w:tc>
+        <w:tc>
+          <w:tcPr>
+            <w:tcW w:type="dxa" w:w="2351"/>
+          </w:tcPr>
+          <w:p>
+            <w:r>
+              <w:t>9/9 성공</w:t>
+            </w:r>
+          </w:p>
+        </w:tc>
+        <w:tc>
+          <w:tcPr>
+            <w:tcW w:type="dxa" w:w="2351"/>
+          </w:tcPr>
+          <w:p>
+            <w:r>
+              <w:t>정상</w:t>
+            </w:r>
+          </w:p>
+        </w:tc>
+        <w:tc>
+          <w:tcPr>
+            <w:tcW w:type="dxa" w:w="2351"/>
+          </w:tcPr>
+          <w:p>
+            <w:r>
+              <w:t>2026082200019</w:t>
+            </w:r>
+          </w:p>
+        </w:tc>
+      </w:tr>
+      <w:tr>
+        <w:tc>
+          <w:tcPr>
+            <w:tcW w:type="dxa" w:w="2351"/>
+          </w:tcPr>
+          <w:p>
+            <w:r>
+              <w:t>LX3 ICE</w:t>
+            </w:r>
+          </w:p>
+        </w:tc>
+        <w:tc>
+          <w:tcPr>
+            <w:tcW w:type="dxa" w:w="2351"/>
+          </w:tcPr>
+          <w:p>
+            <w:r>
+              <w:t>9/9 성공</w:t>
+            </w:r>
+          </w:p>
+        </w:tc>
+        <w:tc>
+          <w:tcPr>
+            <w:tcW w:type="dxa" w:w="2351"/>
+          </w:tcPr>
+          <w:p>
+            <w:r>
+              <w:t>정상</w:t>
+            </w:r>
+          </w:p>
+        </w:tc>
+        <w:tc>
+          <w:tcPr>
+            <w:tcW w:type="dxa" w:w="2351"/>
+          </w:tcPr>
+          <w:p>
+            <w:r>
+              <w:t>2026082200020</w:t>
+            </w:r>
+          </w:p>
+        </w:tc>
+      </w:tr>
+      <w:tr>
+        <w:tc>
+          <w:tcPr>
+            <w:tcW w:type="dxa" w:w="2351"/>
+          </w:tcPr>
+          <w:p>
+            <w:r>
+              <w:t>FF↔CF TP 침입</w:t>
+            </w:r>
+          </w:p>
+        </w:tc>
+        <w:tc>
+          <w:tcPr>
+            <w:tcW w:type="dxa" w:w="2351"/>
+          </w:tcPr>
+          <w:p>
+            <w:r>
+              <w:t>0건</w:t>
+            </w:r>
+          </w:p>
+        </w:tc>
+        <w:tc>
+          <w:tcPr>
+            <w:tcW w:type="dxa" w:w="2351"/>
+          </w:tcPr>
+          <w:p>
+            <w:r>
+              <w:t>—</w:t>
+            </w:r>
+          </w:p>
+        </w:tc>
+        <w:tc>
+          <w:tcPr>
+            <w:tcW w:type="dxa" w:w="2351"/>
+          </w:tcPr>
+          <w:p>
+            <w:r>
+              <w:t>—</w:t>
+            </w:r>
+          </w:p>
+        </w:tc>
+      </w:tr>
+    </w:tbl>
     <w:sectPr>
       <w:pgSz w:w="12240" w:h="15840"/>
       <w:pgMar w:top="1134" w:right="1417" w:bottom="1134" w:left="1417" w:header="720" w:footer="720" w:gutter="0"/>

</xml_diff>